<commit_message>
Rapport secteur : corrections de mise en forme
Co-Authored-By: Claude Opus 5.5 <noreply@anthropic.com>
Claude-Session: https://claude.ai/code/session_01C9sDnYKDbULNV97hyVicrp
</commit_message>
<xml_diff>
--- a/documents/RAPPORT-SECTEUR-SAINT-ROMUALD-1873-1874.docx
+++ b/documents/RAPPORT-SECTEUR-SAINT-ROMUALD-1873-1874.docx
@@ -209,13 +209,7 @@
         <w:t xml:space="preserve"> </w:t>
       </w:r>
       <w:r>
-        <w:t xml:space="preserve">Patrick</w:t>
-      </w:r>
-      <w:r>
-        <w:t xml:space="preserve"> </w:t>
-      </w:r>
-      <w:r>
-        <w:t xml:space="preserve">Charles,</w:t>
+        <w:t xml:space="preserve">Patrick,</w:t>
       </w:r>
       <w:r>
         <w:t xml:space="preserve"> </w:t>
@@ -801,13 +795,13 @@
         <w:t xml:space="preserve"> </w:t>
       </w:r>
       <w:r>
-        <w:t xml:space="preserve">mais il n’apparaît dans aucun des recensements dépouillés (1871, 1881, 1891)</w:t>
-      </w:r>
-      <w:r>
-        <w:t xml:space="preserve"> </w:t>
-      </w:r>
-      <w:r>
-        <w:t xml:space="preserve">: arrivé après avril 1871, il n’est plus recensé dans la paroisse en 1881, ou</w:t>
+        <w:t xml:space="preserve">mais il n’apparaît dans aucun des recensements dépouillés (1871, 1881, 1891) :</w:t>
+      </w:r>
+      <w:r>
+        <w:t xml:space="preserve"> </w:t>
+      </w:r>
+      <w:r>
+        <w:t xml:space="preserve">arrivé après avril 1871, il n’est plus recensé dans la paroisse en 1881, ou</w:t>
       </w:r>
       <w:r>
         <w:t xml:space="preserve"> </w:t>
@@ -1443,13 +1437,19 @@
         <w:pStyle w:val="Compact"/>
       </w:pPr>
       <w:r>
-        <w:t xml:space="preserve">Le jour se lit « deux » dans deux actes et « six » dans un</w:t>
-      </w:r>
-      <w:r>
-        <w:t xml:space="preserve"> </w:t>
-      </w:r>
-      <w:r>
-        <w:t xml:space="preserve">troisième.</w:t>
+        <w:t xml:space="preserve">Le jour se lit « deux » dans la sommation n° 25 et dans le corps de la</w:t>
+      </w:r>
+      <w:r>
+        <w:t xml:space="preserve"> </w:t>
+      </w:r>
+      <w:r>
+        <w:t xml:space="preserve">sommation n° 40, mais « six » en marge du n° 40 et dans la sommation</w:t>
+      </w:r>
+      <w:r>
+        <w:t xml:space="preserve"> </w:t>
+      </w:r>
+      <w:r>
+        <w:t xml:space="preserve">n° 119.</w:t>
       </w:r>
       <w:r>
         <w:rPr>
@@ -4174,7 +4174,7 @@
           <w:ilvl w:val="0"/>
           <w:numId w:val="1010"/>
         </w:numPr>
-        <w:pStyle w:val="DefinitionTerm"/>
+        <w:pStyle w:val="Compact"/>
       </w:pPr>
       <w:r>
         <w:rPr>
@@ -4184,19 +4184,7 @@
         <w:t xml:space="preserve">Edouard Bourassa</w:t>
       </w:r>
       <w:r>
-        <w:t xml:space="preserve">, « cultivateur &amp; commerçant », puis « agriculteur »</w:t>
-      </w:r>
-    </w:p>
-    <w:p>
-      <w:pPr>
-        <w:numPr>
-          <w:ilvl w:val="0"/>
-          <w:numId w:val="1000"/>
-        </w:numPr>
-        <w:pStyle w:val="Compact"/>
-      </w:pPr>
-      <w:r>
-        <w:t xml:space="preserve">témoin des testaments Pichette (n° 4 et 5), déposant (n° 12), témoin</w:t>
+        <w:t xml:space="preserve">, « cultivateur &amp; commerçant », puis « agriculteur » : témoin des testaments Pichette (n° 4 et 5), déposant (n° 12), témoin</w:t>
       </w:r>
       <w:r>
         <w:t xml:space="preserve"> </w:t>

</xml_diff>